<commit_message>
Backup auto 2025-09-15 21:00:29
</commit_message>
<xml_diff>
--- a/ZZ échanges avec Gemini/00000 prompt pour  Doc État du Projet.docx
+++ b/ZZ échanges avec Gemini/00000 prompt pour  Doc État du Projet.docx
@@ -8,6 +8,12 @@
           <w:bCs/>
         </w:rPr>
       </w:pPr>
+      <w:r>
+        <w:rPr>
+          <w:bCs/>
+        </w:rPr>
+        <w:t xml:space="preserve"> </w:t>
+      </w:r>
       <w:r>
         <w:rPr>
           <w:bCs/>

</xml_diff>